<commit_message>
Add workflow diagram and update README, remove assets from gitignore
Co-authored-by: Cursor <cursoragent@cursor.com>
</commit_message>
<xml_diff>
--- a/src/data/Test Reference Text.docx
+++ b/src/data/Test Reference Text.docx
@@ -565,7 +565,19 @@
         <w:rPr>
           <w:rFonts w:ascii="Times New Roman" w:hAnsi="Times New Roman" w:cs="Times New Roman"/>
         </w:rPr>
-        <w:t xml:space="preserve">What can we put in place right now to help you stay safe? Is there someone you can contact, such as family, friends, or emergency professionals, if you are having thoughts about taking your own life? </w:t>
+        <w:t>What can we put in place right now to help you stay safe? Is there someone you can contact, such as family, friends, or emergency professionals, if you are having thoughts about</w:t>
+      </w:r>
+      <w:r>
+        <w:rPr>
+          <w:rFonts w:ascii="Times New Roman" w:hAnsi="Times New Roman" w:cs="Times New Roman"/>
+        </w:rPr>
+        <w:t xml:space="preserve"> killing yourself</w:t>
+      </w:r>
+      <w:r>
+        <w:rPr>
+          <w:rFonts w:ascii="Times New Roman" w:hAnsi="Times New Roman" w:cs="Times New Roman"/>
+        </w:rPr>
+        <w:t xml:space="preserve">? </w:t>
       </w:r>
     </w:p>
     <w:p>

</xml_diff>